<commit_message>
Finalize pricing delivery, shared training, and project cleanup
</commit_message>
<xml_diff>
--- a/docs/deliverables/研究报告大纲_H0与Base混合模型.docx
+++ b/docs/deliverables/研究报告大纲_H0与Base混合模型.docx
@@ -1570,7 +1570,7 @@
           <w:b w:val="0"/>
           <w:sz w:val="25"/>
         </w:rPr>
-        <w:t>7,204笔原始订单 → 7,055笔风险样本 → 5,934笔Base可比样本</w:t>
+        <w:t>7,204笔交付订单 → 7,055笔风险样本 → 5,934笔Base可比样本</w:t>
       </w:r>
     </w:p>
     <w:p>
@@ -18002,7 +18002,7 @@
           <w:b w:val="0"/>
           <w:sz w:val="19"/>
         </w:rPr>
-        <w:t>平均加价0.1286%，中位数0.00375%，最大0.9998%；3,902笔产生数值可见变化，1,234笔总加价≥0.1%，其余影响很小。单场贡献≥0.1%的事件共6个；发布后单场贡献≥0.1%的记录仅53笔。三个月MAE均略升，总体月等权MAE由184.440升至184.489。</w:t>
+        <w:t>平均加价0.1286%，中位数0.00375%，最大0.9998%；3,902笔产生数值可见变化，1,234笔总加价≥0.1%，其余影响很小。单场贡献≥0.1%的事件共6个；发布后达到该幅度的事件贡献记录为53条。三个月MAE均略升，总体月等权MAE由184.440升至184.489。</w:t>
       </w:r>
     </w:p>
     <w:p>
@@ -19668,7 +19668,7 @@
           <w:b w:val="0"/>
           <w:sz w:val="19"/>
         </w:rPr>
-        <w:t>样本口径：报告沿用历史共同队列，其中包括既有跨月未结算订单排除规则；重构没有补回这些订单。未来扩大样本或改变无标签运行方式应另立比较，保持当前报告来源清楚。</w:t>
+        <w:t>样本口径：7,204笔来自已做负markup过滤的旧官方训练文件；本报告保留跨月未结算订单的排除规则。Base按官方说明作为创建时可观察输入使用；匹配报价的原始时刻未随数据提供，属提供方记录边界。</w:t>
       </w:r>
     </w:p>
     <w:p>

</xml_diff>